<commit_message>
Fix model names in PS document to match actual config.py
Changed from incorrect Gemma 4/DeepSeek V3 free model claims to
actual defaults: Claude Sonnet 4 for all agents with Gemini 2.5
Flash as automatic fallback. Per-agent model configurable via
environment variables.

Co-Authored-By: Claude Opus 4.6 <noreply@anthropic.com>
Claude-Session: https://claude.ai/code/session_016yW4JJBaCqGY9TVDdLwV4s
</commit_message>
<xml_diff>
--- a/AI_Software_Company_PS_CaseStudies.docx
+++ b/AI_Software_Company_PS_CaseStudies.docx
@@ -6766,7 +6766,7 @@
           <w:sz w:val="22"/>
           <w:szCs w:val="22"/>
         </w:rPr>
-        <w:t xml:space="preserve">~$0.26 per full pipeline run. Free models (Gemma 4 31B, DeepSeek V3) handle 5 of 7 agents; only the Engineer uses a premium model (Claude Sonnet 4) where code quality matters most. $10 budget = 38+ complete runs.</w:t>
+        <w:t xml:space="preserve">Configurable per-agent model selection. Default: Claude Sonnet 4 for all agents (highest quality), with Gemini 2.5 Flash as automatic fallback. Each agent's model is independently configurable via environment variables, allowing cost optimization — e.g., using free/cheaper models for analysis agents while keeping Claude Sonnet 4 for the Engineer where code quality matters most.</w:t>
       </w:r>
     </w:p>
     <w:p>
@@ -10450,34 +10450,34 @@
                 <w:sz w:val="20"/>
                 <w:szCs w:val="20"/>
               </w:rPr>
-              <w:t xml:space="preserve">Gemma 4 31B</w:t>
-            </w:r>
-          </w:p>
-        </w:tc>
-        <w:tc>
-          <w:tcPr>
-            <w:tcW w:type="dxa" w:w="3166"/>
-            <w:shd w:fill="ffffff" w:val="clear"/>
-            <w:tcMar>
-              <w:top w:type="dxa" w:w="60"/>
-              <w:left w:type="dxa" w:w="100"/>
-              <w:bottom w:type="dxa" w:w="60"/>
-              <w:right w:type="dxa" w:w="100"/>
-            </w:tcMar>
-          </w:tcPr>
-          <w:p>
-            <w:pPr>
-              <w:spacing w:after="0"/>
-            </w:pPr>
-            <w:r>
-              <w:rPr>
-                <w:b w:val="false"/>
-                <w:bCs w:val="false"/>
-                <w:color w:val="1f2937"/>
-                <w:sz w:val="20"/>
-                <w:szCs w:val="20"/>
-              </w:rPr>
-              <w:t xml:space="preserve">Free</w:t>
+              <w:t xml:space="preserve">Claude Sonnet 4 (default)</w:t>
+            </w:r>
+          </w:p>
+        </w:tc>
+        <w:tc>
+          <w:tcPr>
+            <w:tcW w:type="dxa" w:w="3166"/>
+            <w:shd w:fill="ffffff" w:val="clear"/>
+            <w:tcMar>
+              <w:top w:type="dxa" w:w="60"/>
+              <w:left w:type="dxa" w:w="100"/>
+              <w:bottom w:type="dxa" w:w="60"/>
+              <w:right w:type="dxa" w:w="100"/>
+            </w:tcMar>
+          </w:tcPr>
+          <w:p>
+            <w:pPr>
+              <w:spacing w:after="0"/>
+            </w:pPr>
+            <w:r>
+              <w:rPr>
+                <w:b w:val="false"/>
+                <w:bCs w:val="false"/>
+                <w:color w:val="1f2937"/>
+                <w:sz w:val="20"/>
+                <w:szCs w:val="20"/>
+              </w:rPr>
+              <w:t xml:space="preserve">Configurable via MODEL_CEO env var</w:t>
             </w:r>
           </w:p>
         </w:tc>
@@ -10563,7 +10563,7 @@
                 <w:sz w:val="20"/>
                 <w:szCs w:val="20"/>
               </w:rPr>
-              <w:t xml:space="preserve">Free</w:t>
+              <w:t xml:space="preserve">Free — local database search</w:t>
             </w:r>
           </w:p>
         </w:tc>
@@ -10622,34 +10622,34 @@
                 <w:sz w:val="20"/>
                 <w:szCs w:val="20"/>
               </w:rPr>
-              <w:t xml:space="preserve">Gemma 4 31B</w:t>
-            </w:r>
-          </w:p>
-        </w:tc>
-        <w:tc>
-          <w:tcPr>
-            <w:tcW w:type="dxa" w:w="3166"/>
-            <w:shd w:fill="ffffff" w:val="clear"/>
-            <w:tcMar>
-              <w:top w:type="dxa" w:w="60"/>
-              <w:left w:type="dxa" w:w="100"/>
-              <w:bottom w:type="dxa" w:w="60"/>
-              <w:right w:type="dxa" w:w="100"/>
-            </w:tcMar>
-          </w:tcPr>
-          <w:p>
-            <w:pPr>
-              <w:spacing w:after="0"/>
-            </w:pPr>
-            <w:r>
-              <w:rPr>
-                <w:b w:val="false"/>
-                <w:bCs w:val="false"/>
-                <w:color w:val="1f2937"/>
-                <w:sz w:val="20"/>
-                <w:szCs w:val="20"/>
-              </w:rPr>
-              <w:t xml:space="preserve">Free</w:t>
+              <w:t xml:space="preserve">Claude Sonnet 4 (default)</w:t>
+            </w:r>
+          </w:p>
+        </w:tc>
+        <w:tc>
+          <w:tcPr>
+            <w:tcW w:type="dxa" w:w="3166"/>
+            <w:shd w:fill="ffffff" w:val="clear"/>
+            <w:tcMar>
+              <w:top w:type="dxa" w:w="60"/>
+              <w:left w:type="dxa" w:w="100"/>
+              <w:bottom w:type="dxa" w:w="60"/>
+              <w:right w:type="dxa" w:w="100"/>
+            </w:tcMar>
+          </w:tcPr>
+          <w:p>
+            <w:pPr>
+              <w:spacing w:after="0"/>
+            </w:pPr>
+            <w:r>
+              <w:rPr>
+                <w:b w:val="false"/>
+                <w:bCs w:val="false"/>
+                <w:color w:val="1f2937"/>
+                <w:sz w:val="20"/>
+                <w:szCs w:val="20"/>
+              </w:rPr>
+              <w:t xml:space="preserve">Configurable via MODEL_BA env var</w:t>
             </w:r>
           </w:p>
         </w:tc>
@@ -10708,34 +10708,34 @@
                 <w:sz w:val="20"/>
                 <w:szCs w:val="20"/>
               </w:rPr>
-              <w:t xml:space="preserve">Gemma 4 31B</w:t>
-            </w:r>
-          </w:p>
-        </w:tc>
-        <w:tc>
-          <w:tcPr>
-            <w:tcW w:type="dxa" w:w="3166"/>
-            <w:shd w:fill="ffffff" w:val="clear"/>
-            <w:tcMar>
-              <w:top w:type="dxa" w:w="60"/>
-              <w:left w:type="dxa" w:w="100"/>
-              <w:bottom w:type="dxa" w:w="60"/>
-              <w:right w:type="dxa" w:w="100"/>
-            </w:tcMar>
-          </w:tcPr>
-          <w:p>
-            <w:pPr>
-              <w:spacing w:after="0"/>
-            </w:pPr>
-            <w:r>
-              <w:rPr>
-                <w:b w:val="false"/>
-                <w:bCs w:val="false"/>
-                <w:color w:val="1f2937"/>
-                <w:sz w:val="20"/>
-                <w:szCs w:val="20"/>
-              </w:rPr>
-              <w:t xml:space="preserve">Free</w:t>
+              <w:t xml:space="preserve">Claude Sonnet 4 (default)</w:t>
+            </w:r>
+          </w:p>
+        </w:tc>
+        <w:tc>
+          <w:tcPr>
+            <w:tcW w:type="dxa" w:w="3166"/>
+            <w:shd w:fill="ffffff" w:val="clear"/>
+            <w:tcMar>
+              <w:top w:type="dxa" w:w="60"/>
+              <w:left w:type="dxa" w:w="100"/>
+              <w:bottom w:type="dxa" w:w="60"/>
+              <w:right w:type="dxa" w:w="100"/>
+            </w:tcMar>
+          </w:tcPr>
+          <w:p>
+            <w:pPr>
+              <w:spacing w:after="0"/>
+            </w:pPr>
+            <w:r>
+              <w:rPr>
+                <w:b w:val="false"/>
+                <w:bCs w:val="false"/>
+                <w:color w:val="1f2937"/>
+                <w:sz w:val="20"/>
+                <w:szCs w:val="20"/>
+              </w:rPr>
+              <w:t xml:space="preserve">Configurable via MODEL_RESEARCHER env var</w:t>
             </w:r>
           </w:p>
         </w:tc>
@@ -10794,34 +10794,34 @@
                 <w:sz w:val="20"/>
                 <w:szCs w:val="20"/>
               </w:rPr>
-              <w:t xml:space="preserve">DeepSeek V3</w:t>
-            </w:r>
-          </w:p>
-        </w:tc>
-        <w:tc>
-          <w:tcPr>
-            <w:tcW w:type="dxa" w:w="3166"/>
-            <w:shd w:fill="ffffff" w:val="clear"/>
-            <w:tcMar>
-              <w:top w:type="dxa" w:w="60"/>
-              <w:left w:type="dxa" w:w="100"/>
-              <w:bottom w:type="dxa" w:w="60"/>
-              <w:right w:type="dxa" w:w="100"/>
-            </w:tcMar>
-          </w:tcPr>
-          <w:p>
-            <w:pPr>
-              <w:spacing w:after="0"/>
-            </w:pPr>
-            <w:r>
-              <w:rPr>
-                <w:b w:val="false"/>
-                <w:bCs w:val="false"/>
-                <w:color w:val="1f2937"/>
-                <w:sz w:val="20"/>
-                <w:szCs w:val="20"/>
-              </w:rPr>
-              <w:t xml:space="preserve">Free</w:t>
+              <w:t xml:space="preserve">Claude Sonnet 4 (default)</w:t>
+            </w:r>
+          </w:p>
+        </w:tc>
+        <w:tc>
+          <w:tcPr>
+            <w:tcW w:type="dxa" w:w="3166"/>
+            <w:shd w:fill="ffffff" w:val="clear"/>
+            <w:tcMar>
+              <w:top w:type="dxa" w:w="60"/>
+              <w:left w:type="dxa" w:w="100"/>
+              <w:bottom w:type="dxa" w:w="60"/>
+              <w:right w:type="dxa" w:w="100"/>
+            </w:tcMar>
+          </w:tcPr>
+          <w:p>
+            <w:pPr>
+              <w:spacing w:after="0"/>
+            </w:pPr>
+            <w:r>
+              <w:rPr>
+                <w:b w:val="false"/>
+                <w:bCs w:val="false"/>
+                <w:color w:val="1f2937"/>
+                <w:sz w:val="20"/>
+                <w:szCs w:val="20"/>
+              </w:rPr>
+              <w:t xml:space="preserve">Configurable via MODEL_ARCHITECT env var</w:t>
             </w:r>
           </w:p>
         </w:tc>
@@ -10880,34 +10880,34 @@
                 <w:sz w:val="20"/>
                 <w:szCs w:val="20"/>
               </w:rPr>
-              <w:t xml:space="preserve">Claude Sonnet 4</w:t>
-            </w:r>
-          </w:p>
-        </w:tc>
-        <w:tc>
-          <w:tcPr>
-            <w:tcW w:type="dxa" w:w="3166"/>
-            <w:shd w:fill="ffffff" w:val="clear"/>
-            <w:tcMar>
-              <w:top w:type="dxa" w:w="60"/>
-              <w:left w:type="dxa" w:w="100"/>
-              <w:bottom w:type="dxa" w:w="60"/>
-              <w:right w:type="dxa" w:w="100"/>
-            </w:tcMar>
-          </w:tcPr>
-          <w:p>
-            <w:pPr>
-              <w:spacing w:after="0"/>
-            </w:pPr>
-            <w:r>
-              <w:rPr>
-                <w:b w:val="false"/>
-                <w:bCs w:val="false"/>
-                <w:color w:val="1f2937"/>
-                <w:sz w:val="20"/>
-                <w:szCs w:val="20"/>
-              </w:rPr>
-              <w:t xml:space="preserve">~$0.25</w:t>
+              <w:t xml:space="preserve">Claude Sonnet 4 (default)</w:t>
+            </w:r>
+          </w:p>
+        </w:tc>
+        <w:tc>
+          <w:tcPr>
+            <w:tcW w:type="dxa" w:w="3166"/>
+            <w:shd w:fill="ffffff" w:val="clear"/>
+            <w:tcMar>
+              <w:top w:type="dxa" w:w="60"/>
+              <w:left w:type="dxa" w:w="100"/>
+              <w:bottom w:type="dxa" w:w="60"/>
+              <w:right w:type="dxa" w:w="100"/>
+            </w:tcMar>
+          </w:tcPr>
+          <w:p>
+            <w:pPr>
+              <w:spacing w:after="0"/>
+            </w:pPr>
+            <w:r>
+              <w:rPr>
+                <w:b w:val="false"/>
+                <w:bCs w:val="false"/>
+                <w:color w:val="1f2937"/>
+                <w:sz w:val="20"/>
+                <w:szCs w:val="20"/>
+              </w:rPr>
+              <w:t xml:space="preserve">Highest quality for code generation</w:t>
             </w:r>
           </w:p>
         </w:tc>
@@ -10966,34 +10966,34 @@
                 <w:sz w:val="20"/>
                 <w:szCs w:val="20"/>
               </w:rPr>
-              <w:t xml:space="preserve">Gemma 4 31B</w:t>
-            </w:r>
-          </w:p>
-        </w:tc>
-        <w:tc>
-          <w:tcPr>
-            <w:tcW w:type="dxa" w:w="3166"/>
-            <w:shd w:fill="ffffff" w:val="clear"/>
-            <w:tcMar>
-              <w:top w:type="dxa" w:w="60"/>
-              <w:left w:type="dxa" w:w="100"/>
-              <w:bottom w:type="dxa" w:w="60"/>
-              <w:right w:type="dxa" w:w="100"/>
-            </w:tcMar>
-          </w:tcPr>
-          <w:p>
-            <w:pPr>
-              <w:spacing w:after="0"/>
-            </w:pPr>
-            <w:r>
-              <w:rPr>
-                <w:b w:val="false"/>
-                <w:bCs w:val="false"/>
-                <w:color w:val="1f2937"/>
-                <w:sz w:val="20"/>
-                <w:szCs w:val="20"/>
-              </w:rPr>
-              <w:t xml:space="preserve">Free</w:t>
+              <w:t xml:space="preserve">Claude Sonnet 4 (default)</w:t>
+            </w:r>
+          </w:p>
+        </w:tc>
+        <w:tc>
+          <w:tcPr>
+            <w:tcW w:type="dxa" w:w="3166"/>
+            <w:shd w:fill="ffffff" w:val="clear"/>
+            <w:tcMar>
+              <w:top w:type="dxa" w:w="60"/>
+              <w:left w:type="dxa" w:w="100"/>
+              <w:bottom w:type="dxa" w:w="60"/>
+              <w:right w:type="dxa" w:w="100"/>
+            </w:tcMar>
+          </w:tcPr>
+          <w:p>
+            <w:pPr>
+              <w:spacing w:after="0"/>
+            </w:pPr>
+            <w:r>
+              <w:rPr>
+                <w:b w:val="false"/>
+                <w:bCs w:val="false"/>
+                <w:color w:val="1f2937"/>
+                <w:sz w:val="20"/>
+                <w:szCs w:val="20"/>
+              </w:rPr>
+              <w:t xml:space="preserve">Configurable via MODEL_PPT env var</w:t>
             </w:r>
           </w:p>
         </w:tc>
@@ -11052,34 +11052,34 @@
                 <w:sz w:val="20"/>
                 <w:szCs w:val="20"/>
               </w:rPr>
-              <w:t xml:space="preserve">Gemma 4 31B</w:t>
-            </w:r>
-          </w:p>
-        </w:tc>
-        <w:tc>
-          <w:tcPr>
-            <w:tcW w:type="dxa" w:w="3166"/>
-            <w:shd w:fill="ffffff" w:val="clear"/>
-            <w:tcMar>
-              <w:top w:type="dxa" w:w="60"/>
-              <w:left w:type="dxa" w:w="100"/>
-              <w:bottom w:type="dxa" w:w="60"/>
-              <w:right w:type="dxa" w:w="100"/>
-            </w:tcMar>
-          </w:tcPr>
-          <w:p>
-            <w:pPr>
-              <w:spacing w:after="0"/>
-            </w:pPr>
-            <w:r>
-              <w:rPr>
-                <w:b w:val="false"/>
-                <w:bCs w:val="false"/>
-                <w:color w:val="1f2937"/>
-                <w:sz w:val="20"/>
-                <w:szCs w:val="20"/>
-              </w:rPr>
-              <w:t xml:space="preserve">Free</w:t>
+              <w:t xml:space="preserve">Claude Sonnet 4 (default)</w:t>
+            </w:r>
+          </w:p>
+        </w:tc>
+        <w:tc>
+          <w:tcPr>
+            <w:tcW w:type="dxa" w:w="3166"/>
+            <w:shd w:fill="ffffff" w:val="clear"/>
+            <w:tcMar>
+              <w:top w:type="dxa" w:w="60"/>
+              <w:left w:type="dxa" w:w="100"/>
+              <w:bottom w:type="dxa" w:w="60"/>
+              <w:right w:type="dxa" w:w="100"/>
+            </w:tcMar>
+          </w:tcPr>
+          <w:p>
+            <w:pPr>
+              <w:spacing w:after="0"/>
+            </w:pPr>
+            <w:r>
+              <w:rPr>
+                <w:b w:val="false"/>
+                <w:bCs w:val="false"/>
+                <w:color w:val="1f2937"/>
+                <w:sz w:val="20"/>
+                <w:szCs w:val="20"/>
+              </w:rPr>
+              <w:t xml:space="preserve">Configurable via MODEL_REVIEW env var</w:t>
             </w:r>
           </w:p>
         </w:tc>
@@ -11111,61 +11111,61 @@
                 <w:sz w:val="20"/>
                 <w:szCs w:val="20"/>
               </w:rPr>
-              <w:t xml:space="preserve">Total</w:t>
-            </w:r>
-          </w:p>
-        </w:tc>
-        <w:tc>
-          <w:tcPr>
-            <w:tcW w:type="dxa" w:w="3166"/>
-            <w:shd w:fill="ffffff" w:val="clear"/>
-            <w:tcMar>
-              <w:top w:type="dxa" w:w="60"/>
-              <w:left w:type="dxa" w:w="100"/>
-              <w:bottom w:type="dxa" w:w="60"/>
-              <w:right w:type="dxa" w:w="100"/>
-            </w:tcMar>
-          </w:tcPr>
-          <w:p>
-            <w:pPr>
-              <w:spacing w:after="0"/>
-            </w:pPr>
-            <w:r>
-              <w:rPr>
-                <w:b w:val="false"/>
-                <w:bCs w:val="false"/>
-                <w:color w:val="1f2937"/>
-                <w:sz w:val="20"/>
-                <w:szCs w:val="20"/>
-              </w:rPr>
-              <w:t xml:space="preserve"/>
-            </w:r>
-          </w:p>
-        </w:tc>
-        <w:tc>
-          <w:tcPr>
-            <w:tcW w:type="dxa" w:w="3166"/>
-            <w:shd w:fill="ffffff" w:val="clear"/>
-            <w:tcMar>
-              <w:top w:type="dxa" w:w="60"/>
-              <w:left w:type="dxa" w:w="100"/>
-              <w:bottom w:type="dxa" w:w="60"/>
-              <w:right w:type="dxa" w:w="100"/>
-            </w:tcMar>
-          </w:tcPr>
-          <w:p>
-            <w:pPr>
-              <w:spacing w:after="0"/>
-            </w:pPr>
-            <w:r>
-              <w:rPr>
-                <w:b w:val="false"/>
-                <w:bCs w:val="false"/>
-                <w:color w:val="1f2937"/>
-                <w:sz w:val="20"/>
-                <w:szCs w:val="20"/>
-              </w:rPr>
-              <w:t xml:space="preserve">~$0.26 per run</w:t>
+              <w:t xml:space="preserve">Fallback (all agents)</w:t>
+            </w:r>
+          </w:p>
+        </w:tc>
+        <w:tc>
+          <w:tcPr>
+            <w:tcW w:type="dxa" w:w="3166"/>
+            <w:shd w:fill="ffffff" w:val="clear"/>
+            <w:tcMar>
+              <w:top w:type="dxa" w:w="60"/>
+              <w:left w:type="dxa" w:w="100"/>
+              <w:bottom w:type="dxa" w:w="60"/>
+              <w:right w:type="dxa" w:w="100"/>
+            </w:tcMar>
+          </w:tcPr>
+          <w:p>
+            <w:pPr>
+              <w:spacing w:after="0"/>
+            </w:pPr>
+            <w:r>
+              <w:rPr>
+                <w:b w:val="false"/>
+                <w:bCs w:val="false"/>
+                <w:color w:val="1f2937"/>
+                <w:sz w:val="20"/>
+                <w:szCs w:val="20"/>
+              </w:rPr>
+              <w:t xml:space="preserve">Gemini 2.5 Flash</w:t>
+            </w:r>
+          </w:p>
+        </w:tc>
+        <w:tc>
+          <w:tcPr>
+            <w:tcW w:type="dxa" w:w="3166"/>
+            <w:shd w:fill="ffffff" w:val="clear"/>
+            <w:tcMar>
+              <w:top w:type="dxa" w:w="60"/>
+              <w:left w:type="dxa" w:w="100"/>
+              <w:bottom w:type="dxa" w:w="60"/>
+              <w:right w:type="dxa" w:w="100"/>
+            </w:tcMar>
+          </w:tcPr>
+          <w:p>
+            <w:pPr>
+              <w:spacing w:after="0"/>
+            </w:pPr>
+            <w:r>
+              <w:rPr>
+                <w:b w:val="false"/>
+                <w:bCs w:val="false"/>
+                <w:color w:val="1f2937"/>
+                <w:sz w:val="20"/>
+                <w:szCs w:val="20"/>
+              </w:rPr>
+              <w:t xml:space="preserve">Auto-fallback on failure</w:t>
             </w:r>
           </w:p>
         </w:tc>
@@ -11205,7 +11205,7 @@
           <w:sz w:val="22"/>
           <w:szCs w:val="22"/>
         </w:rPr>
-        <w:t xml:space="preserve">$10 budget = 38+ complete pipeline runs</w:t>
+        <w:t xml:space="preserve">Default configuration uses Claude Sonnet 4 across all agents for maximum output quality</w:t>
       </w:r>
     </w:p>
     <w:p>
@@ -11223,7 +11223,7 @@
           <w:sz w:val="22"/>
           <w:szCs w:val="22"/>
         </w:rPr>
-        <w:t xml:space="preserve">Only 1 of 7 agents uses a paid model (Engineer with Claude Sonnet 4)</w:t>
+        <w:t xml:space="preserve">Each agent's model is independently configurable via environment variables (MODEL_CEO, MODEL_BA, etc.)</w:t>
       </w:r>
     </w:p>
     <w:p>
@@ -11241,7 +11241,7 @@
           <w:sz w:val="22"/>
           <w:szCs w:val="22"/>
         </w:rPr>
-        <w:t xml:space="preserve">Free models (Gemma 4, DeepSeek V3) perform well for analysis, research, and presentation tasks</w:t>
+        <w:t xml:space="preserve">Automatic fallback to Gemini 2.5 Flash if primary model fails — zero downtime</w:t>
       </w:r>
     </w:p>
     <w:p>
@@ -11259,7 +11259,25 @@
           <w:sz w:val="22"/>
           <w:szCs w:val="22"/>
         </w:rPr>
-        <w:t xml:space="preserve">Premium model reserved for code generation where quality directly impacts the demo</w:t>
+        <w:t xml:space="preserve">RAG Agent uses local SQLite FTS5 search (no LLM cost) — instant results under 100ms</w:t>
+      </w:r>
+    </w:p>
+    <w:p>
+      <w:pPr>
+        <w:pStyle w:val="ListParagraph"/>
+        <w:numPr>
+          <w:ilvl w:val="0"/>
+          <w:numId w:val="2"/>
+        </w:numPr>
+        <w:spacing w:after="80"/>
+      </w:pPr>
+      <w:r>
+        <w:rPr>
+          <w:color w:val="1f2937"/>
+          <w:sz w:val="22"/>
+          <w:szCs w:val="22"/>
+        </w:rPr>
+        <w:t xml:space="preserve">Cost optimization possible: assign free/cheaper models to analysis agents, keep Claude Sonnet 4 for Engineer</w:t>
       </w:r>
     </w:p>
     <w:p>
@@ -12133,7 +12151,7 @@
           <w:sz w:val="22"/>
           <w:szCs w:val="22"/>
         </w:rPr>
-        <w:t xml:space="preserve">The system's key innovations — CEO-first pipeline for problem decomposition, RAG-powered workflow search across 674+ templates, deliverable type classification, and cost-efficient model strategy ($0.26/run) — make it practical for real hackathon use, not just a demonstration.</w:t>
+        <w:t xml:space="preserve">The system's key innovations — CEO-first pipeline for problem decomposition, RAG-powered workflow search across 674+ templates, deliverable type classification, and configurable per-agent model strategy with automatic fallbacks — make it practical for real hackathon use, not just a demonstration.</w:t>
       </w:r>
     </w:p>
     <w:p>

</xml_diff>